<commit_message>
Remove 'What we did' section from executive summary
Co-Authored-By: Claude Sonnet 5.5 <noreply@anthropic.com>
Claude-Session: https://claude.ai/code/session_01LugvseKmF2BjFkEv28Djej
</commit_message>
<xml_diff>
--- a/Anjali_Labtech_Executive_Security_Summary.docx
+++ b/Anjali_Labtech_Executive_Security_Summary.docx
@@ -996,7 +996,7 @@
           <w:sz w:val="21"/>
           <w:szCs w:val="21"/>
         </w:rPr>
-        <w:t xml:space="preserve">This summary explains each issue in plain language and what it could do to the business. It then sets out exactly how to fix it and in what order. Section 11 shows how Selkey can take this off your IT team’s plate.</w:t>
+        <w:t xml:space="preserve">This summary explains each issue in plain language and what it could do to the business. It then sets out exactly how to fix it and in what order. Section 10 shows how Selkey can take this off your IT team’s plate.</w:t>
       </w:r>
     </w:p>
     <w:p>
@@ -1017,380 +1017,7 @@
           <w:sz w:val="30"/>
           <w:szCs w:val="30"/>
         </w:rPr>
-        <w:t xml:space="preserve">2. What we did</w:t>
-      </w:r>
-    </w:p>
-    <w:p>
-      <w:pPr>
-        <w:spacing w:after="120" w:line="276"/>
-      </w:pPr>
-      <w:r>
-        <w:rPr>
-          <w:rFonts w:ascii="Arial" w:cs="Arial" w:eastAsia="Arial" w:hAnsi="Arial"/>
-          <w:sz w:val="21"/>
-          <w:szCs w:val="21"/>
-        </w:rPr>
-        <w:t xml:space="preserve">With your permission and under careful control we played the part of a determined intruder. We tried to find the weak spots in your office computers and servers and network equipment and CCTV cameras. It is far better for us to find them first than for a criminal to find them.</w:t>
-      </w:r>
-    </w:p>
-    <w:tbl>
-      <w:tblPr>
-        <w:tblW w:type="dxa" w:w="9906"/>
-        <w:tblBorders>
-          <w:top w:val="single" w:color="auto" w:sz="4"/>
-          <w:left w:val="single" w:color="auto" w:sz="4"/>
-          <w:bottom w:val="single" w:color="auto" w:sz="4"/>
-          <w:right w:val="single" w:color="auto" w:sz="4"/>
-          <w:insideH w:val="single" w:color="auto" w:sz="4"/>
-          <w:insideV w:val="single" w:color="auto" w:sz="4"/>
-        </w:tblBorders>
-      </w:tblPr>
-      <w:tblGrid>
-        <w:gridCol w:w="2500"/>
-        <w:gridCol w:w="7406"/>
-      </w:tblGrid>
-      <w:tr>
-        <w:trPr>
-          <w:cantSplit/>
-          <w:tblHeader/>
-        </w:trPr>
-        <w:tc>
-          <w:tcPr>
-            <w:tcW w:type="dxa" w:w="2500"/>
-            <w:tcBorders>
-              <w:top w:val="single" w:color="BFC7D5" w:sz="4"/>
-              <w:left w:val="single" w:color="BFC7D5" w:sz="4"/>
-              <w:bottom w:val="single" w:color="BFC7D5" w:sz="4"/>
-              <w:right w:val="single" w:color="BFC7D5" w:sz="4"/>
-            </w:tcBorders>
-            <w:shd w:fill="1F3A6E" w:color="auto" w:val="clear"/>
-            <w:tcMar>
-              <w:top w:type="dxa" w:w="70"/>
-              <w:left w:type="dxa" w:w="110"/>
-              <w:bottom w:type="dxa" w:w="70"/>
-              <w:right w:type="dxa" w:w="110"/>
-            </w:tcMar>
-            <w:vAlign w:val="top"/>
-          </w:tcPr>
-          <w:p>
-            <w:pPr>
-              <w:spacing w:after="50" w:line="260"/>
-            </w:pPr>
-            <w:r>
-              <w:rPr>
-                <w:rFonts w:ascii="Arial" w:cs="Arial" w:eastAsia="Arial" w:hAnsi="Arial"/>
-                <w:b/>
-                <w:bCs/>
-                <w:color w:val="FFFFFF"/>
-                <w:sz w:val="19"/>
-                <w:szCs w:val="19"/>
-              </w:rPr>
-              <w:t xml:space="preserve">Area</w:t>
-            </w:r>
-          </w:p>
-        </w:tc>
-        <w:tc>
-          <w:tcPr>
-            <w:tcW w:type="dxa" w:w="7406"/>
-            <w:tcBorders>
-              <w:top w:val="single" w:color="BFC7D5" w:sz="4"/>
-              <w:left w:val="single" w:color="BFC7D5" w:sz="4"/>
-              <w:bottom w:val="single" w:color="BFC7D5" w:sz="4"/>
-              <w:right w:val="single" w:color="BFC7D5" w:sz="4"/>
-            </w:tcBorders>
-            <w:shd w:fill="1F3A6E" w:color="auto" w:val="clear"/>
-            <w:tcMar>
-              <w:top w:type="dxa" w:w="70"/>
-              <w:left w:type="dxa" w:w="110"/>
-              <w:bottom w:type="dxa" w:w="70"/>
-              <w:right w:type="dxa" w:w="110"/>
-            </w:tcMar>
-            <w:vAlign w:val="top"/>
-          </w:tcPr>
-          <w:p>
-            <w:pPr>
-              <w:spacing w:after="50" w:line="260"/>
-            </w:pPr>
-            <w:r>
-              <w:rPr>
-                <w:rFonts w:ascii="Arial" w:cs="Arial" w:eastAsia="Arial" w:hAnsi="Arial"/>
-                <w:b/>
-                <w:bCs/>
-                <w:color w:val="FFFFFF"/>
-                <w:sz w:val="19"/>
-                <w:szCs w:val="19"/>
-              </w:rPr>
-              <w:t xml:space="preserve">What was tested</w:t>
-            </w:r>
-          </w:p>
-        </w:tc>
-      </w:tr>
-      <w:tr>
-        <w:trPr>
-          <w:cantSplit/>
-        </w:trPr>
-        <w:tc>
-          <w:tcPr>
-            <w:tcW w:type="dxa" w:w="2500"/>
-            <w:tcBorders>
-              <w:top w:val="single" w:color="BFC7D5" w:sz="4"/>
-              <w:left w:val="single" w:color="BFC7D5" w:sz="4"/>
-              <w:bottom w:val="single" w:color="BFC7D5" w:sz="4"/>
-              <w:right w:val="single" w:color="BFC7D5" w:sz="4"/>
-            </w:tcBorders>
-            <w:shd w:fill="F2F4F8" w:color="auto" w:val="clear"/>
-            <w:tcMar>
-              <w:top w:type="dxa" w:w="70"/>
-              <w:left w:type="dxa" w:w="110"/>
-              <w:bottom w:type="dxa" w:w="70"/>
-              <w:right w:type="dxa" w:w="110"/>
-            </w:tcMar>
-            <w:vAlign w:val="top"/>
-          </w:tcPr>
-          <w:p>
-            <w:pPr>
-              <w:spacing w:after="50" w:line="260"/>
-            </w:pPr>
-            <w:r>
-              <w:rPr>
-                <w:rFonts w:ascii="Arial" w:cs="Arial" w:eastAsia="Arial" w:hAnsi="Arial"/>
-                <w:b/>
-                <w:bCs/>
-                <w:sz w:val="19"/>
-                <w:szCs w:val="19"/>
-              </w:rPr>
-              <w:t xml:space="preserve">Office computers and network</w:t>
-            </w:r>
-          </w:p>
-        </w:tc>
-        <w:tc>
-          <w:tcPr>
-            <w:tcW w:type="dxa" w:w="7406"/>
-            <w:tcBorders>
-              <w:top w:val="single" w:color="BFC7D5" w:sz="4"/>
-              <w:left w:val="single" w:color="BFC7D5" w:sz="4"/>
-              <w:bottom w:val="single" w:color="BFC7D5" w:sz="4"/>
-              <w:right w:val="single" w:color="BFC7D5" w:sz="4"/>
-            </w:tcBorders>
-            <w:tcMar>
-              <w:top w:type="dxa" w:w="70"/>
-              <w:left w:type="dxa" w:w="110"/>
-              <w:bottom w:type="dxa" w:w="70"/>
-              <w:right w:type="dxa" w:w="110"/>
-            </w:tcMar>
-            <w:vAlign w:val="top"/>
-          </w:tcPr>
-          <w:p>
-            <w:pPr>
-              <w:spacing w:after="50" w:line="260"/>
-            </w:pPr>
-            <w:r>
-              <w:rPr>
-                <w:rFonts w:ascii="Arial" w:cs="Arial" w:eastAsia="Arial" w:hAnsi="Arial"/>
-                <w:sz w:val="19"/>
-                <w:szCs w:val="19"/>
-              </w:rPr>
-              <w:t xml:space="preserve">414 computers and 6 servers and 2 routers. Grey box test from inside your network while everything was running as normal. Overall risk rating: </w:t>
-            </w:r>
-            <w:r>
-              <w:rPr>
-                <w:rFonts w:ascii="Arial" w:cs="Arial" w:eastAsia="Arial" w:hAnsi="Arial"/>
-                <w:b/>
-                <w:bCs/>
-                <w:sz w:val="19"/>
-                <w:szCs w:val="19"/>
-              </w:rPr>
-              <w:t xml:space="preserve">High</w:t>
-            </w:r>
-            <w:r>
-              <w:rPr>
-                <w:rFonts w:ascii="Arial" w:cs="Arial" w:eastAsia="Arial" w:hAnsi="Arial"/>
-                <w:sz w:val="19"/>
-                <w:szCs w:val="19"/>
-              </w:rPr>
-              <w:t xml:space="preserve">.</w:t>
-            </w:r>
-          </w:p>
-        </w:tc>
-      </w:tr>
-      <w:tr>
-        <w:trPr>
-          <w:cantSplit/>
-        </w:trPr>
-        <w:tc>
-          <w:tcPr>
-            <w:tcW w:type="dxa" w:w="2500"/>
-            <w:tcBorders>
-              <w:top w:val="single" w:color="BFC7D5" w:sz="4"/>
-              <w:left w:val="single" w:color="BFC7D5" w:sz="4"/>
-              <w:bottom w:val="single" w:color="BFC7D5" w:sz="4"/>
-              <w:right w:val="single" w:color="BFC7D5" w:sz="4"/>
-            </w:tcBorders>
-            <w:shd w:fill="F2F4F8" w:color="auto" w:val="clear"/>
-            <w:tcMar>
-              <w:top w:type="dxa" w:w="70"/>
-              <w:left w:type="dxa" w:w="110"/>
-              <w:bottom w:type="dxa" w:w="70"/>
-              <w:right w:type="dxa" w:w="110"/>
-            </w:tcMar>
-            <w:vAlign w:val="top"/>
-          </w:tcPr>
-          <w:p>
-            <w:pPr>
-              <w:spacing w:after="50" w:line="260"/>
-            </w:pPr>
-            <w:r>
-              <w:rPr>
-                <w:rFonts w:ascii="Arial" w:cs="Arial" w:eastAsia="Arial" w:hAnsi="Arial"/>
-                <w:b/>
-                <w:bCs/>
-                <w:sz w:val="19"/>
-                <w:szCs w:val="19"/>
-              </w:rPr>
-              <w:t xml:space="preserve">CCTV cameras and recorders</w:t>
-            </w:r>
-          </w:p>
-        </w:tc>
-        <w:tc>
-          <w:tcPr>
-            <w:tcW w:type="dxa" w:w="7406"/>
-            <w:tcBorders>
-              <w:top w:val="single" w:color="BFC7D5" w:sz="4"/>
-              <w:left w:val="single" w:color="BFC7D5" w:sz="4"/>
-              <w:bottom w:val="single" w:color="BFC7D5" w:sz="4"/>
-              <w:right w:val="single" w:color="BFC7D5" w:sz="4"/>
-            </w:tcBorders>
-            <w:tcMar>
-              <w:top w:type="dxa" w:w="70"/>
-              <w:left w:type="dxa" w:w="110"/>
-              <w:bottom w:type="dxa" w:w="70"/>
-              <w:right w:type="dxa" w:w="110"/>
-            </w:tcMar>
-            <w:vAlign w:val="top"/>
-          </w:tcPr>
-          <w:p>
-            <w:pPr>
-              <w:spacing w:after="50" w:line="260"/>
-            </w:pPr>
-            <w:r>
-              <w:rPr>
-                <w:rFonts w:ascii="Arial" w:cs="Arial" w:eastAsia="Arial" w:hAnsi="Arial"/>
-                <w:sz w:val="19"/>
-                <w:szCs w:val="19"/>
-              </w:rPr>
-              <w:t xml:space="preserve">446 devices including recorders and the CCTV gateway. Same method. Overall risk rating: </w:t>
-            </w:r>
-            <w:r>
-              <w:rPr>
-                <w:rFonts w:ascii="Arial" w:cs="Arial" w:eastAsia="Arial" w:hAnsi="Arial"/>
-                <w:b/>
-                <w:bCs/>
-                <w:sz w:val="19"/>
-                <w:szCs w:val="19"/>
-              </w:rPr>
-              <w:t xml:space="preserve">Medium</w:t>
-            </w:r>
-            <w:r>
-              <w:rPr>
-                <w:rFonts w:ascii="Arial" w:cs="Arial" w:eastAsia="Arial" w:hAnsi="Arial"/>
-                <w:sz w:val="19"/>
-                <w:szCs w:val="19"/>
-              </w:rPr>
-              <w:t xml:space="preserve">.</w:t>
-            </w:r>
-          </w:p>
-        </w:tc>
-      </w:tr>
-      <w:tr>
-        <w:trPr>
-          <w:cantSplit/>
-        </w:trPr>
-        <w:tc>
-          <w:tcPr>
-            <w:tcW w:type="dxa" w:w="2500"/>
-            <w:tcBorders>
-              <w:top w:val="single" w:color="BFC7D5" w:sz="4"/>
-              <w:left w:val="single" w:color="BFC7D5" w:sz="4"/>
-              <w:bottom w:val="single" w:color="BFC7D5" w:sz="4"/>
-              <w:right w:val="single" w:color="BFC7D5" w:sz="4"/>
-            </w:tcBorders>
-            <w:shd w:fill="F2F4F8" w:color="auto" w:val="clear"/>
-            <w:tcMar>
-              <w:top w:type="dxa" w:w="70"/>
-              <w:left w:type="dxa" w:w="110"/>
-              <w:bottom w:type="dxa" w:w="70"/>
-              <w:right w:type="dxa" w:w="110"/>
-            </w:tcMar>
-            <w:vAlign w:val="top"/>
-          </w:tcPr>
-          <w:p>
-            <w:pPr>
-              <w:spacing w:after="50" w:line="260"/>
-            </w:pPr>
-            <w:r>
-              <w:rPr>
-                <w:rFonts w:ascii="Arial" w:cs="Arial" w:eastAsia="Arial" w:hAnsi="Arial"/>
-                <w:b/>
-                <w:bCs/>
-                <w:sz w:val="19"/>
-                <w:szCs w:val="19"/>
-              </w:rPr>
-              <w:t xml:space="preserve">How we tested</w:t>
-            </w:r>
-          </w:p>
-        </w:tc>
-        <w:tc>
-          <w:tcPr>
-            <w:tcW w:type="dxa" w:w="7406"/>
-            <w:tcBorders>
-              <w:top w:val="single" w:color="BFC7D5" w:sz="4"/>
-              <w:left w:val="single" w:color="BFC7D5" w:sz="4"/>
-              <w:bottom w:val="single" w:color="BFC7D5" w:sz="4"/>
-              <w:right w:val="single" w:color="BFC7D5" w:sz="4"/>
-            </w:tcBorders>
-            <w:tcMar>
-              <w:top w:type="dxa" w:w="70"/>
-              <w:left w:type="dxa" w:w="110"/>
-              <w:bottom w:type="dxa" w:w="70"/>
-              <w:right w:type="dxa" w:w="110"/>
-            </w:tcMar>
-            <w:vAlign w:val="top"/>
-          </w:tcPr>
-          <w:p>
-            <w:pPr>
-              <w:spacing w:after="50" w:line="260"/>
-            </w:pPr>
-            <w:r>
-              <w:rPr>
-                <w:rFonts w:ascii="Arial" w:cs="Arial" w:eastAsia="Arial" w:hAnsi="Arial"/>
-                <w:sz w:val="19"/>
-                <w:szCs w:val="19"/>
-              </w:rPr>
-              <w:t xml:space="preserve">Network discovery and port and service scanning and vulnerability scanning with commercial and open source tools. Manual checks to confirm the results.</w:t>
-            </w:r>
-          </w:p>
-        </w:tc>
-      </w:tr>
-    </w:tbl>
-    <w:p>
-      <w:pPr>
-        <w:pStyle w:val="Heading1"/>
-        <w:keepNext/>
-        <w:pBdr>
-          <w:bottom w:val="single" w:color="1F3A6E" w:sz="8" w:space="4"/>
-        </w:pBdr>
-        <w:spacing w:after="140" w:before="360"/>
-      </w:pPr>
-      <w:r>
-        <w:rPr>
-          <w:rFonts w:ascii="Arial" w:cs="Arial" w:eastAsia="Arial" w:hAnsi="Arial"/>
-          <w:b/>
-          <w:bCs/>
-          <w:color w:val="1F3A6E"/>
-          <w:sz w:val="30"/>
-          <w:szCs w:val="30"/>
-        </w:rPr>
-        <w:t xml:space="preserve">3. The results in numbers</w:t>
+        <w:t xml:space="preserve">2. The results in numbers</w:t>
       </w:r>
     </w:p>
     <w:tbl>
@@ -2437,7 +2064,7 @@
           <w:sz w:val="30"/>
           <w:szCs w:val="30"/>
         </w:rPr>
-        <w:t xml:space="preserve">4. What could actually happen to the business</w:t>
+        <w:t xml:space="preserve">3. What could actually happen to the business</w:t>
       </w:r>
     </w:p>
     <w:p>
@@ -3351,7 +2978,7 @@
           <w:sz w:val="30"/>
           <w:szCs w:val="30"/>
         </w:rPr>
-        <w:t xml:space="preserve">5. The five big gaps in everyday words</w:t>
+        <w:t xml:space="preserve">4. The five big gaps in everyday words</w:t>
       </w:r>
     </w:p>
     <w:p>
@@ -4205,7 +3832,7 @@
           <w:sz w:val="30"/>
           <w:szCs w:val="30"/>
         </w:rPr>
-        <w:t xml:space="preserve">6. Office computers and network: issues, impact and fixes</w:t>
+        <w:t xml:space="preserve">5. Office computers and network: issues, impact and fixes</w:t>
       </w:r>
     </w:p>
     <w:p>
@@ -6433,7 +6060,7 @@
           <w:sz w:val="30"/>
           <w:szCs w:val="30"/>
         </w:rPr>
-        <w:t xml:space="preserve">7. CCTV system: issues, impact and fixes</w:t>
+        <w:t xml:space="preserve">6. CCTV system: issues, impact and fixes</w:t>
       </w:r>
     </w:p>
     <w:p>
@@ -8489,7 +8116,7 @@
           <w:sz w:val="30"/>
           <w:szCs w:val="30"/>
         </w:rPr>
-        <w:t xml:space="preserve">8. What to fix and in what order</w:t>
+        <w:t xml:space="preserve">7. What to fix and in what order</w:t>
       </w:r>
     </w:p>
     <w:p>
@@ -10197,7 +9824,7 @@
           <w:sz w:val="30"/>
           <w:szCs w:val="30"/>
         </w:rPr>
-        <w:t xml:space="preserve">9. Mandatory recommendations from the Certificate of Assessment</w:t>
+        <w:t xml:space="preserve">8. Mandatory recommendations from the Certificate of Assessment</w:t>
       </w:r>
     </w:p>
     <w:p>
@@ -11363,7 +10990,7 @@
           <w:sz w:val="30"/>
           <w:szCs w:val="30"/>
         </w:rPr>
-        <w:t xml:space="preserve">10. Why act now</w:t>
+        <w:t xml:space="preserve">9. Why act now</w:t>
       </w:r>
     </w:p>
     <w:tbl>
@@ -12007,7 +11634,7 @@
           <w:sz w:val="30"/>
           <w:szCs w:val="30"/>
         </w:rPr>
-        <w:t xml:space="preserve">11. How Selkey can help you close this quickly</w:t>
+        <w:t xml:space="preserve">10. How Selkey can help you close this quickly</w:t>
       </w:r>
     </w:p>
     <w:p>
@@ -13601,7 +13228,7 @@
           <w:sz w:val="30"/>
           <w:szCs w:val="30"/>
         </w:rPr>
-        <w:t xml:space="preserve">12. Proposed next steps</w:t>
+        <w:t xml:space="preserve">11. Proposed next steps</w:t>
       </w:r>
     </w:p>
     <w:p>
@@ -14082,7 +13709,7 @@
           <w:sz w:val="30"/>
           <w:szCs w:val="30"/>
         </w:rPr>
-        <w:t xml:space="preserve">13. A few words you may hear</w:t>
+        <w:t xml:space="preserve">12. A few words you may hear</w:t>
       </w:r>
     </w:p>
     <w:tbl>

</xml_diff>

<commit_message>
Limit issue sections to network vulnerabilities
Co-Authored-By: Claude Sonnet 5.5 <noreply@anthropic.com>
Claude-Session: https://claude.ai/code/session_01LugvseKmF2BjFkEv28Djej
</commit_message>
<xml_diff>
--- a/Anjali_Labtech_Executive_Security_Summary.docx
+++ b/Anjali_Labtech_Executive_Security_Summary.docx
@@ -3832,7 +3832,7 @@
           <w:sz w:val="30"/>
           <w:szCs w:val="30"/>
         </w:rPr>
-        <w:t xml:space="preserve">5. Office computers and network: issues, impact and fixes</w:t>
+        <w:t xml:space="preserve">5. Network vulnerabilities: issues, impact and fixes</w:t>
       </w:r>
     </w:p>
     <w:p>
@@ -3845,7 +3845,7 @@
           <w:sz w:val="21"/>
           <w:szCs w:val="21"/>
         </w:rPr>
-        <w:t xml:space="preserve">The 730 findings fall into eight themes. The number of computers affected comes from the detailed findings table in the network report. Computers appear in more than one theme.</w:t>
+        <w:t xml:space="preserve">This section covers weaknesses in how systems talk to each other over the network. Findings that are about out-of-date software (Office and browsers and Adobe and other tools) are left out. Host counts come from the detailed findings table in the network report.</w:t>
       </w:r>
     </w:p>
     <w:tbl>
@@ -3899,7 +3899,7 @@
                 <w:sz w:val="21"/>
                 <w:szCs w:val="21"/>
               </w:rPr>
-              <w:t xml:space="preserve">1. Old Office and .NET   |   VERY SERIOUS</w:t>
+              <w:t xml:space="preserve">1. Flaws that let malware spread by itself   |   VERY SERIOUS / SERIOUS</w:t>
             </w:r>
           </w:p>
         </w:tc>
@@ -3969,7 +3969,7 @@
                 <w:sz w:val="19"/>
                 <w:szCs w:val="19"/>
               </w:rPr>
-              <w:t xml:space="preserve">.NET Framework needs updating on 154 computers. Office products on 116. Outlook on 87. Office versions no longer supported by Microsoft on 78. Dozens of known Office flaws from 2010 to 2017 remain open on 20 to 47 computers each.</w:t>
+              <w:t xml:space="preserve">A few hosts expose network services with known remote attacks. EternalBlue (MS17-010) on up to 5 listings. BlueKeep remote desktop (CVE-2019-0708) on 1 host. MSMQ QueueJumper (CVE-2023-21554) on 1 host. SMBv1 on 1 host. Windows web server flaw (HTTP.sys) on 2. Print Spooler on 3. Older remote desktop flaws on 5.</w:t>
             </w:r>
           </w:p>
         </w:tc>
@@ -4039,7 +4039,7 @@
                 <w:sz w:val="19"/>
                 <w:szCs w:val="19"/>
               </w:rPr>
-              <w:t xml:space="preserve">A booby-trapped document or email attachment can run an attacker’s program on the user’s computer with no warning. This is the most common way ransomware starts.</w:t>
+              <w:t xml:space="preserve">An attacker or malware can take over these hosts over the network with no user action and then spread to others. This is how WannaCry and Petya spread. Few hosts are affected but one is enough to start an outbreak.</w:t>
             </w:r>
           </w:p>
         </w:tc>
@@ -4109,7 +4109,7 @@
                 <w:sz w:val="19"/>
                 <w:szCs w:val="19"/>
               </w:rPr>
-              <w:t xml:space="preserve">Move every computer to a supported Microsoft 365 or Office version. Patch .NET. Block macros from the internet. Roll out updates centrally with WSUS or Intune so they stop depending on each user.</w:t>
+              <w:t xml:space="preserve">Patch or isolate the affected hosts within 24 to 72 hours. Disable SMBv1. Block remote desktop and file sharing ports between user networks and from untrusted segments.</w:t>
             </w:r>
           </w:p>
         </w:tc>
@@ -4150,7 +4150,7 @@
               <w:bottom w:val="single" w:color="BFC7D5" w:sz="4"/>
               <w:right w:val="single" w:color="BFC7D5" w:sz="4"/>
             </w:tcBorders>
-            <w:shd w:fill="FBE5E5" w:color="auto" w:val="clear"/>
+            <w:shd w:fill="FDEBDD" w:color="auto" w:val="clear"/>
             <w:tcMar>
               <w:top w:type="dxa" w:w="70"/>
               <w:left w:type="dxa" w:w="110"/>
@@ -4171,7 +4171,7 @@
                 <w:sz w:val="21"/>
                 <w:szCs w:val="21"/>
               </w:rPr>
-              <w:t xml:space="preserve">2. Old browsers and PDF tools   |   VERY SERIOUS</w:t>
+              <w:t xml:space="preserve">2. SMB signing not required   |   SERIOUS</w:t>
             </w:r>
           </w:p>
         </w:tc>
@@ -4241,7 +4241,7 @@
                 <w:sz w:val="19"/>
                 <w:szCs w:val="19"/>
               </w:rPr>
-              <w:t xml:space="preserve">Adobe Reader is outdated on 109 computers and unsupported on 103. Chrome needs updating on 95. Firefox on 51. Edge on 43. Internet Explorer is unsupported on 67. Adobe Flash is still installed on 64.</w:t>
+              <w:t xml:space="preserve">File sharing (SMB) does not require signed messages on 262 hosts.</w:t>
             </w:r>
           </w:p>
         </w:tc>
@@ -4311,7 +4311,7 @@
                 <w:sz w:val="19"/>
                 <w:szCs w:val="19"/>
               </w:rPr>
-              <w:t xml:space="preserve">Visiting a web page or opening a PDF can be enough to take over the computer. Flash and Internet Explorer no longer receive any safety fixes at all.</w:t>
+              <w:t xml:space="preserve">An attacker already on the network can intercept and relay logins (an NTLM relay attack). They can then reach file shares and servers as a real user and possibly as an administrator.</w:t>
             </w:r>
           </w:p>
         </w:tc>
@@ -4381,7 +4381,7 @@
                 <w:sz w:val="19"/>
                 <w:szCs w:val="19"/>
               </w:rPr>
-              <w:t xml:space="preserve">Uninstall Flash and Internet Explorer. Switch on automatic updates for browsers and Adobe Reader. Remove unsupported Adobe products.</w:t>
+              <w:t xml:space="preserve">Require SMB signing on all hosts through Group Policy. Disable NTLM where possible. Restrict which hosts may connect to each other.</w:t>
             </w:r>
           </w:p>
         </w:tc>
@@ -4422,7 +4422,7 @@
               <w:bottom w:val="single" w:color="BFC7D5" w:sz="4"/>
               <w:right w:val="single" w:color="BFC7D5" w:sz="4"/>
             </w:tcBorders>
-            <w:shd w:fill="FBE5E5" w:color="auto" w:val="clear"/>
+            <w:shd w:fill="FFF4CC" w:color="auto" w:val="clear"/>
             <w:tcMar>
               <w:top w:type="dxa" w:w="70"/>
               <w:left w:type="dxa" w:w="110"/>
@@ -4443,7 +4443,7 @@
                 <w:sz w:val="21"/>
                 <w:szCs w:val="21"/>
               </w:rPr>
-              <w:t xml:space="preserve">3. Windows not updated   |   VERY SERIOUS</w:t>
+              <w:t xml:space="preserve">3. Remote desktop (RDP) weaknesses   |   SERIOUS / MODERATE</w:t>
             </w:r>
           </w:p>
         </w:tc>
@@ -4513,7 +4513,7 @@
                 <w:sz w:val="19"/>
                 <w:szCs w:val="19"/>
               </w:rPr>
-              <w:t xml:space="preserve">Monthly security updates are missing on Windows 10 1903 and 1909 (both end of life) and on 60 computers running 21H2 or 22H2. Many Windows 11 machines are behind. Three computers still run Windows 7 or Server 2008 R2.</w:t>
+              <w:t xml:space="preserve">Network Level Authentication is not enforced on 8 hosts. Remote desktop man-in-the-middle weakness on 1. Low or medium encryption level on 1.</w:t>
             </w:r>
           </w:p>
         </w:tc>
@@ -4583,7 +4583,7 @@
                 <w:sz w:val="19"/>
                 <w:szCs w:val="19"/>
               </w:rPr>
-              <w:t xml:space="preserve">Known flaws in the Windows core give an attacker full control and help them move from one computer to the next.</w:t>
+              <w:t xml:space="preserve">Anyone who can reach the port can attempt logins and sit between the user and the host to capture credentials. Weak RDP is a common ransomware entry point.</w:t>
             </w:r>
           </w:p>
         </w:tc>
@@ -4653,7 +4653,7 @@
                 <w:sz w:val="19"/>
                 <w:szCs w:val="19"/>
               </w:rPr>
-              <w:t xml:space="preserve">Upgrade end-of-life Windows to a supported version. Apply monthly updates through central patch management. Retire or isolate Windows 7 and Server 2008 R2 machines.</w:t>
+              <w:t xml:space="preserve">Enforce NLA and high encryption. Allow RDP only through a VPN or gateway and only from approved addresses. Turn on account lockout.</w:t>
             </w:r>
           </w:p>
         </w:tc>
@@ -4694,7 +4694,7 @@
               <w:bottom w:val="single" w:color="BFC7D5" w:sz="4"/>
               <w:right w:val="single" w:color="BFC7D5" w:sz="4"/>
             </w:tcBorders>
-            <w:shd w:fill="FBE5E5" w:color="auto" w:val="clear"/>
+            <w:shd w:fill="FFF4CC" w:color="auto" w:val="clear"/>
             <w:tcMar>
               <w:top w:type="dxa" w:w="70"/>
               <w:left w:type="dxa" w:w="110"/>
@@ -4715,7 +4715,7 @@
                 <w:sz w:val="21"/>
                 <w:szCs w:val="21"/>
               </w:rPr>
-              <w:t xml:space="preserve">4. Flaws that spread by themselves   |   VERY SERIOUS / SERIOUS</w:t>
+              <w:t xml:space="preserve">4. Clear-text and legacy login methods   |   MODERATE</w:t>
             </w:r>
           </w:p>
         </w:tc>
@@ -4785,7 +4785,7 @@
                 <w:sz w:val="19"/>
                 <w:szCs w:val="19"/>
               </w:rPr>
-              <w:t xml:space="preserve">Computers open to EternalBlue (the flaw behind WannaCry and Petya) and BlueKeep remote desktop and the MSMQ QueueJumper flaw. Old Print Spooler and web server (HTTP.sys) flaws on a few computers. One computer still uses the outdated SMBv1 protocol.</w:t>
+              <w:t xml:space="preserve">Telnet on 2 hosts. NTLMv1 enabled on 1. HTTP TRACE and TRACK methods allowed on 4 web servers.</w:t>
             </w:r>
           </w:p>
         </w:tc>
@@ -4855,7 +4855,7 @@
                 <w:sz w:val="19"/>
                 <w:szCs w:val="19"/>
               </w:rPr>
-              <w:t xml:space="preserve">Malware that uses these flaws can spread across the whole network without anyone clicking anything. Few computers are affected but one is enough to start an outbreak.</w:t>
+              <w:t xml:space="preserve">Passwords and commands cross the network as readable text and can be sniffed. NTLMv1 hashes can be cracked quickly. TRACE can help steal session details.</w:t>
             </w:r>
           </w:p>
         </w:tc>
@@ -4925,7 +4925,7 @@
                 <w:sz w:val="19"/>
                 <w:szCs w:val="19"/>
               </w:rPr>
-              <w:t xml:space="preserve">Patch or isolate the affected computers within 24 to 72 hours. Switch off SMBv1. Block remote desktop access from ordinary user networks.</w:t>
+              <w:t xml:space="preserve">Disable Telnet and use SSH. Disable NTLMv1 and allow NTLMv2 or Kerberos only. Disable HTTP TRACE and TRACK.</w:t>
             </w:r>
           </w:p>
         </w:tc>
@@ -4987,7 +4987,7 @@
                 <w:sz w:val="21"/>
                 <w:szCs w:val="21"/>
               </w:rPr>
-              <w:t xml:space="preserve">5. Weak or stale protection software   |   SERIOUS</w:t>
+              <w:t xml:space="preserve">5. Weak encryption on network services   |   SERIOUS / MODERATE</w:t>
             </w:r>
           </w:p>
         </w:tc>
@@ -5057,25 +5057,7 @@
                 <w:sz w:val="19"/>
                 <w:szCs w:val="19"/>
               </w:rPr>
-              <w:t xml:space="preserve">Defender signatures are out of date on 89 computers. Defender needs updating on 61 and its malware engine on 58. Forefront or SCEP client problems on 26. </w:t>
-            </w:r>
-            <w:r>
-              <w:rPr>
-                <w:rFonts w:ascii="Arial" w:cs="Arial" w:eastAsia="Arial" w:hAnsi="Arial"/>
-                <w:b/>
-                <w:bCs/>
-                <w:sz w:val="19"/>
-                <w:szCs w:val="19"/>
-              </w:rPr>
-              <w:t xml:space="preserve">Two computers were flagged as possibly compromised</w:t>
-            </w:r>
-            <w:r>
-              <w:rPr>
-                <w:rFonts w:ascii="Arial" w:cs="Arial" w:eastAsia="Arial" w:hAnsi="Arial"/>
-                <w:sz w:val="19"/>
-                <w:szCs w:val="19"/>
-              </w:rPr>
-              <w:t xml:space="preserve"> by a hosts file check.</w:t>
+              <w:t xml:space="preserve">TLS 1.0 and 1.1 still allowed on 40 hosts. Weak SWEET32 ciphers on 21. Certificates signed with a weak hash on 4. RC4 on 2. SSL 2 and 3 on 2.</w:t>
             </w:r>
           </w:p>
         </w:tc>
@@ -5145,7 +5127,7 @@
                 <w:sz w:val="19"/>
                 <w:szCs w:val="19"/>
               </w:rPr>
-              <w:t xml:space="preserve">Malware could run undetected. The two flagged computers may already be infected and could be leaking data or helping an attacker.</w:t>
+              <w:t xml:space="preserve">Someone who can capture traffic could read or alter data and logins. A forged certificate could let an attacker impersonate a service.</w:t>
             </w:r>
           </w:p>
         </w:tc>
@@ -5215,7 +5197,7 @@
                 <w:sz w:val="19"/>
                 <w:szCs w:val="19"/>
               </w:rPr>
-              <w:t xml:space="preserve">Isolate and investigate the two flagged computers first. Then deploy EDR or XDR on every computer and server.</w:t>
+              <w:t xml:space="preserve">Allow TLS 1.2 or higher only. Remove 3DES and RC4 ciphers. Reissue certificates with SHA-256 and RSA 2048 or higher.</w:t>
             </w:r>
           </w:p>
         </w:tc>
@@ -5256,7 +5238,7 @@
               <w:bottom w:val="single" w:color="BFC7D5" w:sz="4"/>
               <w:right w:val="single" w:color="BFC7D5" w:sz="4"/>
             </w:tcBorders>
-            <w:shd w:fill="FBE5E5" w:color="auto" w:val="clear"/>
+            <w:shd w:fill="FDEBDD" w:color="auto" w:val="clear"/>
             <w:tcMar>
               <w:top w:type="dxa" w:w="70"/>
               <w:left w:type="dxa" w:w="110"/>
@@ -5277,7 +5259,7 @@
                 <w:sz w:val="21"/>
                 <w:szCs w:val="21"/>
               </w:rPr>
-              <w:t xml:space="preserve">6. Risky add-on software   |   VERY SERIOUS / SERIOUS</w:t>
+              <w:t xml:space="preserve">6. Open and unsegmented network   |   SERIOUS</w:t>
             </w:r>
           </w:p>
         </w:tc>
@@ -5347,7 +5329,7 @@
                 <w:sz w:val="19"/>
                 <w:szCs w:val="19"/>
               </w:rPr>
-              <w:t xml:space="preserve">WinRAR is outdated on 184 computers. AnyDesk on 29. VLC on 25. Zoom on 4. TeamViewer and VMware on 2 each. Log4j 1.x on 7 and Apache Struts 2 on 5 (both allow remote takeover). FortiClient on 11 including hard-coded passwords in one file on 7.</w:t>
+              <w:t xml:space="preserve">Per the certificate: internet access is unrestricted where it must be blocked. Any user can change a locally set IP address to bypass restrictions. There is no internal segmentation. CCTV shares the network with office systems.</w:t>
             </w:r>
           </w:p>
         </w:tc>
@@ -5417,7 +5399,7 @@
                 <w:sz w:val="19"/>
                 <w:szCs w:val="19"/>
               </w:rPr>
-              <w:t xml:space="preserve">Every outdated tool is a separate way in. Remote tools such as AnyDesk can let people reach a computer from outside and bypass your network controls.</w:t>
+              <w:t xml:space="preserve">Once an attacker is on one device they can reach everything else. Restrictions that depend on IP addresses can be bypassed. Stolen data can leave freely through the internet.</w:t>
             </w:r>
           </w:p>
         </w:tc>
@@ -5487,551 +5469,7 @@
                 <w:sz w:val="19"/>
                 <w:szCs w:val="19"/>
               </w:rPr>
-              <w:t xml:space="preserve">Keep an approved software list. Remove unapproved remote tools. Patch or replace Log4j and Struts first. Update FortiClient and WinRAR through central management.</w:t>
-            </w:r>
-          </w:p>
-        </w:tc>
-      </w:tr>
-    </w:tbl>
-    <w:p>
-      <w:pPr>
-        <w:spacing w:after="80"/>
-      </w:pPr>
-    </w:p>
-    <w:tbl>
-      <w:tblPr>
-        <w:tblW w:type="dxa" w:w="9906"/>
-        <w:tblBorders>
-          <w:top w:val="single" w:color="auto" w:sz="4"/>
-          <w:left w:val="single" w:color="auto" w:sz="4"/>
-          <w:bottom w:val="single" w:color="auto" w:sz="4"/>
-          <w:right w:val="single" w:color="auto" w:sz="4"/>
-          <w:insideH w:val="single" w:color="auto" w:sz="4"/>
-          <w:insideV w:val="single" w:color="auto" w:sz="4"/>
-        </w:tblBorders>
-      </w:tblPr>
-      <w:tblGrid>
-        <w:gridCol w:w="1700"/>
-        <w:gridCol w:w="8206"/>
-      </w:tblGrid>
-      <w:tr>
-        <w:trPr>
-          <w:cantSplit/>
-        </w:trPr>
-        <w:tc>
-          <w:tcPr>
-            <w:tcW w:type="dxa" w:w="9906"/>
-            <w:gridSpan w:val="2"/>
-            <w:tcBorders>
-              <w:top w:val="single" w:color="BFC7D5" w:sz="4"/>
-              <w:left w:val="single" w:color="BFC7D5" w:sz="4"/>
-              <w:bottom w:val="single" w:color="BFC7D5" w:sz="4"/>
-              <w:right w:val="single" w:color="BFC7D5" w:sz="4"/>
-            </w:tcBorders>
-            <w:shd w:fill="FBE5E5" w:color="auto" w:val="clear"/>
-            <w:tcMar>
-              <w:top w:type="dxa" w:w="70"/>
-              <w:left w:type="dxa" w:w="110"/>
-              <w:bottom w:type="dxa" w:w="70"/>
-              <w:right w:type="dxa" w:w="110"/>
-            </w:tcMar>
-            <w:vAlign w:val="top"/>
-          </w:tcPr>
-          <w:p>
-            <w:pPr>
-              <w:spacing w:after="50" w:line="260"/>
-            </w:pPr>
-            <w:r>
-              <w:rPr>
-                <w:rFonts w:ascii="Arial" w:cs="Arial" w:eastAsia="Arial" w:hAnsi="Arial"/>
-                <w:b/>
-                <w:bCs/>
-                <w:sz w:val="21"/>
-                <w:szCs w:val="21"/>
-              </w:rPr>
-              <w:t xml:space="preserve">7. Database servers   |   VERY SERIOUS / SERIOUS</w:t>
-            </w:r>
-          </w:p>
-        </w:tc>
-      </w:tr>
-      <w:tr>
-        <w:trPr>
-          <w:cantSplit/>
-        </w:trPr>
-        <w:tc>
-          <w:tcPr>
-            <w:tcW w:type="dxa" w:w="1700"/>
-            <w:tcBorders>
-              <w:top w:val="single" w:color="BFC7D5" w:sz="4"/>
-              <w:left w:val="single" w:color="BFC7D5" w:sz="4"/>
-              <w:bottom w:val="single" w:color="BFC7D5" w:sz="4"/>
-              <w:right w:val="single" w:color="BFC7D5" w:sz="4"/>
-            </w:tcBorders>
-            <w:shd w:fill="F2F4F8" w:color="auto" w:val="clear"/>
-            <w:tcMar>
-              <w:top w:type="dxa" w:w="70"/>
-              <w:left w:type="dxa" w:w="110"/>
-              <w:bottom w:type="dxa" w:w="70"/>
-              <w:right w:type="dxa" w:w="110"/>
-            </w:tcMar>
-            <w:vAlign w:val="top"/>
-          </w:tcPr>
-          <w:p>
-            <w:pPr>
-              <w:spacing w:after="50" w:line="260"/>
-            </w:pPr>
-            <w:r>
-              <w:rPr>
-                <w:rFonts w:ascii="Arial" w:cs="Arial" w:eastAsia="Arial" w:hAnsi="Arial"/>
-                <w:b/>
-                <w:bCs/>
-                <w:sz w:val="19"/>
-                <w:szCs w:val="19"/>
-              </w:rPr>
-              <w:t xml:space="preserve">What we found</w:t>
-            </w:r>
-          </w:p>
-        </w:tc>
-        <w:tc>
-          <w:tcPr>
-            <w:tcW w:type="dxa" w:w="8206"/>
-            <w:tcBorders>
-              <w:top w:val="single" w:color="BFC7D5" w:sz="4"/>
-              <w:left w:val="single" w:color="BFC7D5" w:sz="4"/>
-              <w:bottom w:val="single" w:color="BFC7D5" w:sz="4"/>
-              <w:right w:val="single" w:color="BFC7D5" w:sz="4"/>
-            </w:tcBorders>
-            <w:tcMar>
-              <w:top w:type="dxa" w:w="70"/>
-              <w:left w:type="dxa" w:w="110"/>
-              <w:bottom w:type="dxa" w:w="70"/>
-              <w:right w:type="dxa" w:w="110"/>
-            </w:tcMar>
-            <w:vAlign w:val="top"/>
-          </w:tcPr>
-          <w:p>
-            <w:pPr>
-              <w:spacing w:after="50" w:line="260"/>
-            </w:pPr>
-            <w:r>
-              <w:rPr>
-                <w:rFonts w:ascii="Arial" w:cs="Arial" w:eastAsia="Arial" w:hAnsi="Arial"/>
-                <w:sz w:val="19"/>
-                <w:szCs w:val="19"/>
-              </w:rPr>
-              <w:t xml:space="preserve">Four systems run SQL Server versions that Microsoft no longer supports. They include 192.168.7.7 (Main-pc) and 192.168.7.10. Five have a known flaw that lets a user become an administrator.</w:t>
-            </w:r>
-          </w:p>
-        </w:tc>
-      </w:tr>
-      <w:tr>
-        <w:trPr>
-          <w:cantSplit/>
-        </w:trPr>
-        <w:tc>
-          <w:tcPr>
-            <w:tcW w:type="dxa" w:w="1700"/>
-            <w:tcBorders>
-              <w:top w:val="single" w:color="BFC7D5" w:sz="4"/>
-              <w:left w:val="single" w:color="BFC7D5" w:sz="4"/>
-              <w:bottom w:val="single" w:color="BFC7D5" w:sz="4"/>
-              <w:right w:val="single" w:color="BFC7D5" w:sz="4"/>
-            </w:tcBorders>
-            <w:shd w:fill="F2F4F8" w:color="auto" w:val="clear"/>
-            <w:tcMar>
-              <w:top w:type="dxa" w:w="70"/>
-              <w:left w:type="dxa" w:w="110"/>
-              <w:bottom w:type="dxa" w:w="70"/>
-              <w:right w:type="dxa" w:w="110"/>
-            </w:tcMar>
-            <w:vAlign w:val="top"/>
-          </w:tcPr>
-          <w:p>
-            <w:pPr>
-              <w:spacing w:after="50" w:line="260"/>
-            </w:pPr>
-            <w:r>
-              <w:rPr>
-                <w:rFonts w:ascii="Arial" w:cs="Arial" w:eastAsia="Arial" w:hAnsi="Arial"/>
-                <w:b/>
-                <w:bCs/>
-                <w:sz w:val="19"/>
-                <w:szCs w:val="19"/>
-              </w:rPr>
-              <w:t xml:space="preserve">Why it matters</w:t>
-            </w:r>
-          </w:p>
-        </w:tc>
-        <w:tc>
-          <w:tcPr>
-            <w:tcW w:type="dxa" w:w="8206"/>
-            <w:tcBorders>
-              <w:top w:val="single" w:color="BFC7D5" w:sz="4"/>
-              <w:left w:val="single" w:color="BFC7D5" w:sz="4"/>
-              <w:bottom w:val="single" w:color="BFC7D5" w:sz="4"/>
-              <w:right w:val="single" w:color="BFC7D5" w:sz="4"/>
-            </w:tcBorders>
-            <w:tcMar>
-              <w:top w:type="dxa" w:w="70"/>
-              <w:left w:type="dxa" w:w="110"/>
-              <w:bottom w:type="dxa" w:w="70"/>
-              <w:right w:type="dxa" w:w="110"/>
-            </w:tcMar>
-            <w:vAlign w:val="top"/>
-          </w:tcPr>
-          <w:p>
-            <w:pPr>
-              <w:spacing w:after="50" w:line="260"/>
-            </w:pPr>
-            <w:r>
-              <w:rPr>
-                <w:rFonts w:ascii="Arial" w:cs="Arial" w:eastAsia="Arial" w:hAnsi="Arial"/>
-                <w:sz w:val="19"/>
-                <w:szCs w:val="19"/>
-              </w:rPr>
-              <w:t xml:space="preserve">Business data in these databases could be read or changed. An attacker could gain administrator rights.</w:t>
-            </w:r>
-          </w:p>
-        </w:tc>
-      </w:tr>
-      <w:tr>
-        <w:trPr>
-          <w:cantSplit/>
-        </w:trPr>
-        <w:tc>
-          <w:tcPr>
-            <w:tcW w:type="dxa" w:w="1700"/>
-            <w:tcBorders>
-              <w:top w:val="single" w:color="BFC7D5" w:sz="4"/>
-              <w:left w:val="single" w:color="BFC7D5" w:sz="4"/>
-              <w:bottom w:val="single" w:color="BFC7D5" w:sz="4"/>
-              <w:right w:val="single" w:color="BFC7D5" w:sz="4"/>
-            </w:tcBorders>
-            <w:shd w:fill="F2F4F8" w:color="auto" w:val="clear"/>
-            <w:tcMar>
-              <w:top w:type="dxa" w:w="70"/>
-              <w:left w:type="dxa" w:w="110"/>
-              <w:bottom w:type="dxa" w:w="70"/>
-              <w:right w:type="dxa" w:w="110"/>
-            </w:tcMar>
-            <w:vAlign w:val="top"/>
-          </w:tcPr>
-          <w:p>
-            <w:pPr>
-              <w:spacing w:after="50" w:line="260"/>
-            </w:pPr>
-            <w:r>
-              <w:rPr>
-                <w:rFonts w:ascii="Arial" w:cs="Arial" w:eastAsia="Arial" w:hAnsi="Arial"/>
-                <w:b/>
-                <w:bCs/>
-                <w:sz w:val="19"/>
-                <w:szCs w:val="19"/>
-              </w:rPr>
-              <w:t xml:space="preserve">How to fix it</w:t>
-            </w:r>
-          </w:p>
-        </w:tc>
-        <w:tc>
-          <w:tcPr>
-            <w:tcW w:type="dxa" w:w="8206"/>
-            <w:tcBorders>
-              <w:top w:val="single" w:color="BFC7D5" w:sz="4"/>
-              <w:left w:val="single" w:color="BFC7D5" w:sz="4"/>
-              <w:bottom w:val="single" w:color="BFC7D5" w:sz="4"/>
-              <w:right w:val="single" w:color="BFC7D5" w:sz="4"/>
-            </w:tcBorders>
-            <w:tcMar>
-              <w:top w:type="dxa" w:w="70"/>
-              <w:left w:type="dxa" w:w="110"/>
-              <w:bottom w:type="dxa" w:w="70"/>
-              <w:right w:type="dxa" w:w="110"/>
-            </w:tcMar>
-            <w:vAlign w:val="top"/>
-          </w:tcPr>
-          <w:p>
-            <w:pPr>
-              <w:spacing w:after="50" w:line="260"/>
-            </w:pPr>
-            <w:r>
-              <w:rPr>
-                <w:rFonts w:ascii="Arial" w:cs="Arial" w:eastAsia="Arial" w:hAnsi="Arial"/>
-                <w:sz w:val="19"/>
-                <w:szCs w:val="19"/>
-              </w:rPr>
-              <w:t xml:space="preserve">Upgrade to a supported SQL Server version. Allow connections to port 1433 only from the application servers that need them.</w:t>
-            </w:r>
-          </w:p>
-        </w:tc>
-      </w:tr>
-    </w:tbl>
-    <w:p>
-      <w:pPr>
-        <w:spacing w:after="80"/>
-      </w:pPr>
-    </w:p>
-    <w:tbl>
-      <w:tblPr>
-        <w:tblW w:type="dxa" w:w="9906"/>
-        <w:tblBorders>
-          <w:top w:val="single" w:color="auto" w:sz="4"/>
-          <w:left w:val="single" w:color="auto" w:sz="4"/>
-          <w:bottom w:val="single" w:color="auto" w:sz="4"/>
-          <w:right w:val="single" w:color="auto" w:sz="4"/>
-          <w:insideH w:val="single" w:color="auto" w:sz="4"/>
-          <w:insideV w:val="single" w:color="auto" w:sz="4"/>
-        </w:tblBorders>
-      </w:tblPr>
-      <w:tblGrid>
-        <w:gridCol w:w="1700"/>
-        <w:gridCol w:w="8206"/>
-      </w:tblGrid>
-      <w:tr>
-        <w:trPr>
-          <w:cantSplit/>
-        </w:trPr>
-        <w:tc>
-          <w:tcPr>
-            <w:tcW w:type="dxa" w:w="9906"/>
-            <w:gridSpan w:val="2"/>
-            <w:tcBorders>
-              <w:top w:val="single" w:color="BFC7D5" w:sz="4"/>
-              <w:left w:val="single" w:color="BFC7D5" w:sz="4"/>
-              <w:bottom w:val="single" w:color="BFC7D5" w:sz="4"/>
-              <w:right w:val="single" w:color="BFC7D5" w:sz="4"/>
-            </w:tcBorders>
-            <w:shd w:fill="FFF4CC" w:color="auto" w:val="clear"/>
-            <w:tcMar>
-              <w:top w:type="dxa" w:w="70"/>
-              <w:left w:type="dxa" w:w="110"/>
-              <w:bottom w:type="dxa" w:w="70"/>
-              <w:right w:type="dxa" w:w="110"/>
-            </w:tcMar>
-            <w:vAlign w:val="top"/>
-          </w:tcPr>
-          <w:p>
-            <w:pPr>
-              <w:spacing w:after="50" w:line="260"/>
-            </w:pPr>
-            <w:r>
-              <w:rPr>
-                <w:rFonts w:ascii="Arial" w:cs="Arial" w:eastAsia="Arial" w:hAnsi="Arial"/>
-                <w:b/>
-                <w:bCs/>
-                <w:sz w:val="21"/>
-                <w:szCs w:val="21"/>
-              </w:rPr>
-              <w:t xml:space="preserve">8. Weak settings   |   SERIOUS / MODERATE</w:t>
-            </w:r>
-          </w:p>
-        </w:tc>
-      </w:tr>
-      <w:tr>
-        <w:trPr>
-          <w:cantSplit/>
-        </w:trPr>
-        <w:tc>
-          <w:tcPr>
-            <w:tcW w:type="dxa" w:w="1700"/>
-            <w:tcBorders>
-              <w:top w:val="single" w:color="BFC7D5" w:sz="4"/>
-              <w:left w:val="single" w:color="BFC7D5" w:sz="4"/>
-              <w:bottom w:val="single" w:color="BFC7D5" w:sz="4"/>
-              <w:right w:val="single" w:color="BFC7D5" w:sz="4"/>
-            </w:tcBorders>
-            <w:shd w:fill="F2F4F8" w:color="auto" w:val="clear"/>
-            <w:tcMar>
-              <w:top w:type="dxa" w:w="70"/>
-              <w:left w:type="dxa" w:w="110"/>
-              <w:bottom w:type="dxa" w:w="70"/>
-              <w:right w:type="dxa" w:w="110"/>
-            </w:tcMar>
-            <w:vAlign w:val="top"/>
-          </w:tcPr>
-          <w:p>
-            <w:pPr>
-              <w:spacing w:after="50" w:line="260"/>
-            </w:pPr>
-            <w:r>
-              <w:rPr>
-                <w:rFonts w:ascii="Arial" w:cs="Arial" w:eastAsia="Arial" w:hAnsi="Arial"/>
-                <w:b/>
-                <w:bCs/>
-                <w:sz w:val="19"/>
-                <w:szCs w:val="19"/>
-              </w:rPr>
-              <w:t xml:space="preserve">What we found</w:t>
-            </w:r>
-          </w:p>
-        </w:tc>
-        <w:tc>
-          <w:tcPr>
-            <w:tcW w:type="dxa" w:w="8206"/>
-            <w:tcBorders>
-              <w:top w:val="single" w:color="BFC7D5" w:sz="4"/>
-              <w:left w:val="single" w:color="BFC7D5" w:sz="4"/>
-              <w:bottom w:val="single" w:color="BFC7D5" w:sz="4"/>
-              <w:right w:val="single" w:color="BFC7D5" w:sz="4"/>
-            </w:tcBorders>
-            <w:tcMar>
-              <w:top w:type="dxa" w:w="70"/>
-              <w:left w:type="dxa" w:w="110"/>
-              <w:bottom w:type="dxa" w:w="70"/>
-              <w:right w:type="dxa" w:w="110"/>
-            </w:tcMar>
-            <w:vAlign w:val="top"/>
-          </w:tcPr>
-          <w:p>
-            <w:pPr>
-              <w:spacing w:after="50" w:line="260"/>
-            </w:pPr>
-            <w:r>
-              <w:rPr>
-                <w:rFonts w:ascii="Arial" w:cs="Arial" w:eastAsia="Arial" w:hAnsi="Arial"/>
-                <w:sz w:val="19"/>
-                <w:szCs w:val="19"/>
-              </w:rPr>
-              <w:t xml:space="preserve">File sharing does not require signed messages on 262 computers. Unquoted service paths on 74. Weak service permissions on 26. Windows file-signature check not enabled on 199. PrintNightmare exposure on 67. Remote desktop without extra login check on 8. Telnet on 2. Old NTLMv1 passwords on 1. Old TLS 1.0 and 1.1 on 40. Weak encryption (SWEET32) on 21.</w:t>
-            </w:r>
-          </w:p>
-        </w:tc>
-      </w:tr>
-      <w:tr>
-        <w:trPr>
-          <w:cantSplit/>
-        </w:trPr>
-        <w:tc>
-          <w:tcPr>
-            <w:tcW w:type="dxa" w:w="1700"/>
-            <w:tcBorders>
-              <w:top w:val="single" w:color="BFC7D5" w:sz="4"/>
-              <w:left w:val="single" w:color="BFC7D5" w:sz="4"/>
-              <w:bottom w:val="single" w:color="BFC7D5" w:sz="4"/>
-              <w:right w:val="single" w:color="BFC7D5" w:sz="4"/>
-            </w:tcBorders>
-            <w:shd w:fill="F2F4F8" w:color="auto" w:val="clear"/>
-            <w:tcMar>
-              <w:top w:type="dxa" w:w="70"/>
-              <w:left w:type="dxa" w:w="110"/>
-              <w:bottom w:type="dxa" w:w="70"/>
-              <w:right w:type="dxa" w:w="110"/>
-            </w:tcMar>
-            <w:vAlign w:val="top"/>
-          </w:tcPr>
-          <w:p>
-            <w:pPr>
-              <w:spacing w:after="50" w:line="260"/>
-            </w:pPr>
-            <w:r>
-              <w:rPr>
-                <w:rFonts w:ascii="Arial" w:cs="Arial" w:eastAsia="Arial" w:hAnsi="Arial"/>
-                <w:b/>
-                <w:bCs/>
-                <w:sz w:val="19"/>
-                <w:szCs w:val="19"/>
-              </w:rPr>
-              <w:t xml:space="preserve">Why it matters</w:t>
-            </w:r>
-          </w:p>
-        </w:tc>
-        <w:tc>
-          <w:tcPr>
-            <w:tcW w:type="dxa" w:w="8206"/>
-            <w:tcBorders>
-              <w:top w:val="single" w:color="BFC7D5" w:sz="4"/>
-              <w:left w:val="single" w:color="BFC7D5" w:sz="4"/>
-              <w:bottom w:val="single" w:color="BFC7D5" w:sz="4"/>
-              <w:right w:val="single" w:color="BFC7D5" w:sz="4"/>
-            </w:tcBorders>
-            <w:tcMar>
-              <w:top w:type="dxa" w:w="70"/>
-              <w:left w:type="dxa" w:w="110"/>
-              <w:bottom w:type="dxa" w:w="70"/>
-              <w:right w:type="dxa" w:w="110"/>
-            </w:tcMar>
-            <w:vAlign w:val="top"/>
-          </w:tcPr>
-          <w:p>
-            <w:pPr>
-              <w:spacing w:after="50" w:line="260"/>
-            </w:pPr>
-            <w:r>
-              <w:rPr>
-                <w:rFonts w:ascii="Arial" w:cs="Arial" w:eastAsia="Arial" w:hAnsi="Arial"/>
-                <w:sz w:val="19"/>
-                <w:szCs w:val="19"/>
-              </w:rPr>
-              <w:t xml:space="preserve">An attacker with a small foothold can relay credentials and raise their privileges to administrator. Old encryption lets someone read traffic.</w:t>
-            </w:r>
-          </w:p>
-        </w:tc>
-      </w:tr>
-      <w:tr>
-        <w:trPr>
-          <w:cantSplit/>
-        </w:trPr>
-        <w:tc>
-          <w:tcPr>
-            <w:tcW w:type="dxa" w:w="1700"/>
-            <w:tcBorders>
-              <w:top w:val="single" w:color="BFC7D5" w:sz="4"/>
-              <w:left w:val="single" w:color="BFC7D5" w:sz="4"/>
-              <w:bottom w:val="single" w:color="BFC7D5" w:sz="4"/>
-              <w:right w:val="single" w:color="BFC7D5" w:sz="4"/>
-            </w:tcBorders>
-            <w:shd w:fill="F2F4F8" w:color="auto" w:val="clear"/>
-            <w:tcMar>
-              <w:top w:type="dxa" w:w="70"/>
-              <w:left w:type="dxa" w:w="110"/>
-              <w:bottom w:type="dxa" w:w="70"/>
-              <w:right w:type="dxa" w:w="110"/>
-            </w:tcMar>
-            <w:vAlign w:val="top"/>
-          </w:tcPr>
-          <w:p>
-            <w:pPr>
-              <w:spacing w:after="50" w:line="260"/>
-            </w:pPr>
-            <w:r>
-              <w:rPr>
-                <w:rFonts w:ascii="Arial" w:cs="Arial" w:eastAsia="Arial" w:hAnsi="Arial"/>
-                <w:b/>
-                <w:bCs/>
-                <w:sz w:val="19"/>
-                <w:szCs w:val="19"/>
-              </w:rPr>
-              <w:t xml:space="preserve">How to fix it</w:t>
-            </w:r>
-          </w:p>
-        </w:tc>
-        <w:tc>
-          <w:tcPr>
-            <w:tcW w:type="dxa" w:w="8206"/>
-            <w:tcBorders>
-              <w:top w:val="single" w:color="BFC7D5" w:sz="4"/>
-              <w:left w:val="single" w:color="BFC7D5" w:sz="4"/>
-              <w:bottom w:val="single" w:color="BFC7D5" w:sz="4"/>
-              <w:right w:val="single" w:color="BFC7D5" w:sz="4"/>
-            </w:tcBorders>
-            <w:tcMar>
-              <w:top w:type="dxa" w:w="70"/>
-              <w:left w:type="dxa" w:w="110"/>
-              <w:bottom w:type="dxa" w:w="70"/>
-              <w:right w:type="dxa" w:w="110"/>
-            </w:tcMar>
-            <w:vAlign w:val="top"/>
-          </w:tcPr>
-          <w:p>
-            <w:pPr>
-              <w:spacing w:after="50" w:line="260"/>
-            </w:pPr>
-            <w:r>
-              <w:rPr>
-                <w:rFonts w:ascii="Arial" w:cs="Arial" w:eastAsia="Arial" w:hAnsi="Arial"/>
-                <w:sz w:val="19"/>
-                <w:szCs w:val="19"/>
-              </w:rPr>
-              <w:t xml:space="preserve">Enforce SMB signing and remote desktop settings through Group Policy. Fix service paths and permissions. Switch off Telnet and NTLMv1. Allow TLS 1.2 or higher only.</w:t>
+              <w:t xml:space="preserve">Deploy a next-generation firewall with internal segmentation. Isolate CCTV and servers. Allow only approved ports and services. Assign IPs by DHCP reservation with IP and MAC binding. Block unnecessary internet access.</w:t>
             </w:r>
           </w:p>
         </w:tc>
@@ -6073,7 +5511,7 @@
           <w:sz w:val="21"/>
           <w:szCs w:val="21"/>
         </w:rPr>
-        <w:t xml:space="preserve">There are 22 findings but many are the same issue repeated on many devices. Fixing each pattern once through firmware updates and settings changes clears many together. Device numbers are given so your IT team can find each one quickly.</w:t>
+        <w:t xml:space="preserve">Only network-level weaknesses are shown (open services and weak encryption and clear-text protocols). Out-of-date software versions are left out. Many findings repeat across devices so fixing each pattern once clears many together.</w:t>
       </w:r>
     </w:p>
     <w:p>
@@ -6289,7 +5727,7 @@
                 <w:sz w:val="19"/>
                 <w:szCs w:val="19"/>
               </w:rPr>
-              <w:t xml:space="preserve">192.168.1.8</w:t>
+              <w:t xml:space="preserve">192.168.11.100</w:t>
             </w:r>
           </w:p>
         </w:tc>
@@ -6320,7 +5758,7 @@
                 <w:sz w:val="19"/>
                 <w:szCs w:val="19"/>
               </w:rPr>
-              <w:t xml:space="preserve">The remote control (SSH) software is very old. Ready-made attack tools exist for it.</w:t>
+              <w:t xml:space="preserve">An AI service (Ollama) is open on the network and asks for no password at all.</w:t>
             </w:r>
           </w:p>
         </w:tc>
@@ -6351,7 +5789,7 @@
                 <w:sz w:val="19"/>
                 <w:szCs w:val="19"/>
               </w:rPr>
-              <w:t xml:space="preserve">A stranger on your network could take full control and view or erase recordings or use it to reach other equipment.</w:t>
+              <w:t xml:space="preserve">Anyone on your network could use it freely and misuse it or use it to get further in.</w:t>
             </w:r>
           </w:p>
         </w:tc>
@@ -6382,265 +5820,7 @@
                 <w:sz w:val="19"/>
                 <w:szCs w:val="19"/>
               </w:rPr>
-              <w:t xml:space="preserve">Update the firmware or replace the unit. Allow remote control only from an administrator network.</w:t>
-            </w:r>
-          </w:p>
-        </w:tc>
-      </w:tr>
-      <w:tr>
-        <w:trPr>
-          <w:cantSplit/>
-        </w:trPr>
-        <w:tc>
-          <w:tcPr>
-            <w:tcW w:type="dxa" w:w="1750"/>
-            <w:tcBorders>
-              <w:top w:val="single" w:color="BFC7D5" w:sz="4"/>
-              <w:left w:val="single" w:color="BFC7D5" w:sz="4"/>
-              <w:bottom w:val="single" w:color="BFC7D5" w:sz="4"/>
-              <w:right w:val="single" w:color="BFC7D5" w:sz="4"/>
-            </w:tcBorders>
-            <w:tcMar>
-              <w:top w:type="dxa" w:w="70"/>
-              <w:left w:type="dxa" w:w="110"/>
-              <w:bottom w:type="dxa" w:w="70"/>
-              <w:right w:type="dxa" w:w="110"/>
-            </w:tcMar>
-            <w:vAlign w:val="top"/>
-          </w:tcPr>
-          <w:p>
-            <w:pPr>
-              <w:spacing w:after="50" w:line="260"/>
-            </w:pPr>
-            <w:r>
-              <w:rPr>
-                <w:rFonts w:ascii="Arial" w:cs="Arial" w:eastAsia="Arial" w:hAnsi="Arial"/>
-                <w:sz w:val="19"/>
-                <w:szCs w:val="19"/>
-              </w:rPr>
-              <w:t xml:space="preserve">192.168.11.100</w:t>
-            </w:r>
-          </w:p>
-        </w:tc>
-        <w:tc>
-          <w:tcPr>
-            <w:tcW w:type="dxa" w:w="2500"/>
-            <w:tcBorders>
-              <w:top w:val="single" w:color="BFC7D5" w:sz="4"/>
-              <w:left w:val="single" w:color="BFC7D5" w:sz="4"/>
-              <w:bottom w:val="single" w:color="BFC7D5" w:sz="4"/>
-              <w:right w:val="single" w:color="BFC7D5" w:sz="4"/>
-            </w:tcBorders>
-            <w:tcMar>
-              <w:top w:type="dxa" w:w="70"/>
-              <w:left w:type="dxa" w:w="110"/>
-              <w:bottom w:type="dxa" w:w="70"/>
-              <w:right w:type="dxa" w:w="110"/>
-            </w:tcMar>
-            <w:vAlign w:val="top"/>
-          </w:tcPr>
-          <w:p>
-            <w:pPr>
-              <w:spacing w:after="50" w:line="260"/>
-            </w:pPr>
-            <w:r>
-              <w:rPr>
-                <w:rFonts w:ascii="Arial" w:cs="Arial" w:eastAsia="Arial" w:hAnsi="Arial"/>
-                <w:sz w:val="19"/>
-                <w:szCs w:val="19"/>
-              </w:rPr>
-              <w:t xml:space="preserve">An AI program (Ollama) runs here and asks for no password at all.</w:t>
-            </w:r>
-          </w:p>
-        </w:tc>
-        <w:tc>
-          <w:tcPr>
-            <w:tcW w:type="dxa" w:w="2600"/>
-            <w:tcBorders>
-              <w:top w:val="single" w:color="BFC7D5" w:sz="4"/>
-              <w:left w:val="single" w:color="BFC7D5" w:sz="4"/>
-              <w:bottom w:val="single" w:color="BFC7D5" w:sz="4"/>
-              <w:right w:val="single" w:color="BFC7D5" w:sz="4"/>
-            </w:tcBorders>
-            <w:tcMar>
-              <w:top w:type="dxa" w:w="70"/>
-              <w:left w:type="dxa" w:w="110"/>
-              <w:bottom w:type="dxa" w:w="70"/>
-              <w:right w:type="dxa" w:w="110"/>
-            </w:tcMar>
-            <w:vAlign w:val="top"/>
-          </w:tcPr>
-          <w:p>
-            <w:pPr>
-              <w:spacing w:after="50" w:line="260"/>
-            </w:pPr>
-            <w:r>
-              <w:rPr>
-                <w:rFonts w:ascii="Arial" w:cs="Arial" w:eastAsia="Arial" w:hAnsi="Arial"/>
-                <w:sz w:val="19"/>
-                <w:szCs w:val="19"/>
-              </w:rPr>
-              <w:t xml:space="preserve">Anyone on your network could use it freely and misuse it or use it to get further in.</w:t>
-            </w:r>
-          </w:p>
-        </w:tc>
-        <w:tc>
-          <w:tcPr>
-            <w:tcW w:type="dxa" w:w="3056"/>
-            <w:tcBorders>
-              <w:top w:val="single" w:color="BFC7D5" w:sz="4"/>
-              <w:left w:val="single" w:color="BFC7D5" w:sz="4"/>
-              <w:bottom w:val="single" w:color="BFC7D5" w:sz="4"/>
-              <w:right w:val="single" w:color="BFC7D5" w:sz="4"/>
-            </w:tcBorders>
-            <w:tcMar>
-              <w:top w:type="dxa" w:w="70"/>
-              <w:left w:type="dxa" w:w="110"/>
-              <w:bottom w:type="dxa" w:w="70"/>
-              <w:right w:type="dxa" w:w="110"/>
-            </w:tcMar>
-            <w:vAlign w:val="top"/>
-          </w:tcPr>
-          <w:p>
-            <w:pPr>
-              <w:spacing w:after="50" w:line="260"/>
-            </w:pPr>
-            <w:r>
-              <w:rPr>
-                <w:rFonts w:ascii="Arial" w:cs="Arial" w:eastAsia="Arial" w:hAnsi="Arial"/>
-                <w:sz w:val="19"/>
-                <w:szCs w:val="19"/>
-              </w:rPr>
               <w:t xml:space="preserve">Add a login or place it behind a protected gateway. Allow access only from approved addresses.</w:t>
-            </w:r>
-          </w:p>
-        </w:tc>
-      </w:tr>
-      <w:tr>
-        <w:trPr>
-          <w:cantSplit/>
-        </w:trPr>
-        <w:tc>
-          <w:tcPr>
-            <w:tcW w:type="dxa" w:w="1750"/>
-            <w:tcBorders>
-              <w:top w:val="single" w:color="BFC7D5" w:sz="4"/>
-              <w:left w:val="single" w:color="BFC7D5" w:sz="4"/>
-              <w:bottom w:val="single" w:color="BFC7D5" w:sz="4"/>
-              <w:right w:val="single" w:color="BFC7D5" w:sz="4"/>
-            </w:tcBorders>
-            <w:tcMar>
-              <w:top w:type="dxa" w:w="70"/>
-              <w:left w:type="dxa" w:w="110"/>
-              <w:bottom w:type="dxa" w:w="70"/>
-              <w:right w:type="dxa" w:w="110"/>
-            </w:tcMar>
-            <w:vAlign w:val="top"/>
-          </w:tcPr>
-          <w:p>
-            <w:pPr>
-              <w:spacing w:after="50" w:line="260"/>
-            </w:pPr>
-            <w:r>
-              <w:rPr>
-                <w:rFonts w:ascii="Arial" w:cs="Arial" w:eastAsia="Arial" w:hAnsi="Arial"/>
-                <w:sz w:val="19"/>
-                <w:szCs w:val="19"/>
-              </w:rPr>
-              <w:t xml:space="preserve">192.168.1.196</w:t>
-            </w:r>
-          </w:p>
-        </w:tc>
-        <w:tc>
-          <w:tcPr>
-            <w:tcW w:type="dxa" w:w="2500"/>
-            <w:tcBorders>
-              <w:top w:val="single" w:color="BFC7D5" w:sz="4"/>
-              <w:left w:val="single" w:color="BFC7D5" w:sz="4"/>
-              <w:bottom w:val="single" w:color="BFC7D5" w:sz="4"/>
-              <w:right w:val="single" w:color="BFC7D5" w:sz="4"/>
-            </w:tcBorders>
-            <w:tcMar>
-              <w:top w:type="dxa" w:w="70"/>
-              <w:left w:type="dxa" w:w="110"/>
-              <w:bottom w:type="dxa" w:w="70"/>
-              <w:right w:type="dxa" w:w="110"/>
-            </w:tcMar>
-            <w:vAlign w:val="top"/>
-          </w:tcPr>
-          <w:p>
-            <w:pPr>
-              <w:spacing w:after="50" w:line="260"/>
-            </w:pPr>
-            <w:r>
-              <w:rPr>
-                <w:rFonts w:ascii="Arial" w:cs="Arial" w:eastAsia="Arial" w:hAnsi="Arial"/>
-                <w:sz w:val="19"/>
-                <w:szCs w:val="19"/>
-              </w:rPr>
-              <w:t xml:space="preserve">The remote control (OpenSSH) software is out of date and misses years of safety fixes.</w:t>
-            </w:r>
-          </w:p>
-        </w:tc>
-        <w:tc>
-          <w:tcPr>
-            <w:tcW w:type="dxa" w:w="2600"/>
-            <w:tcBorders>
-              <w:top w:val="single" w:color="BFC7D5" w:sz="4"/>
-              <w:left w:val="single" w:color="BFC7D5" w:sz="4"/>
-              <w:bottom w:val="single" w:color="BFC7D5" w:sz="4"/>
-              <w:right w:val="single" w:color="BFC7D5" w:sz="4"/>
-            </w:tcBorders>
-            <w:tcMar>
-              <w:top w:type="dxa" w:w="70"/>
-              <w:left w:type="dxa" w:w="110"/>
-              <w:bottom w:type="dxa" w:w="70"/>
-              <w:right w:type="dxa" w:w="110"/>
-            </w:tcMar>
-            <w:vAlign w:val="top"/>
-          </w:tcPr>
-          <w:p>
-            <w:pPr>
-              <w:spacing w:after="50" w:line="260"/>
-            </w:pPr>
-            <w:r>
-              <w:rPr>
-                <w:rFonts w:ascii="Arial" w:cs="Arial" w:eastAsia="Arial" w:hAnsi="Arial"/>
-                <w:sz w:val="19"/>
-                <w:szCs w:val="19"/>
-              </w:rPr>
-              <w:t xml:space="preserve">Known weak spots stay open so an outsider could take over this device.</w:t>
-            </w:r>
-          </w:p>
-        </w:tc>
-        <w:tc>
-          <w:tcPr>
-            <w:tcW w:type="dxa" w:w="3056"/>
-            <w:tcBorders>
-              <w:top w:val="single" w:color="BFC7D5" w:sz="4"/>
-              <w:left w:val="single" w:color="BFC7D5" w:sz="4"/>
-              <w:bottom w:val="single" w:color="BFC7D5" w:sz="4"/>
-              <w:right w:val="single" w:color="BFC7D5" w:sz="4"/>
-            </w:tcBorders>
-            <w:tcMar>
-              <w:top w:type="dxa" w:w="70"/>
-              <w:left w:type="dxa" w:w="110"/>
-              <w:bottom w:type="dxa" w:w="70"/>
-              <w:right w:type="dxa" w:w="110"/>
-            </w:tcMar>
-            <w:vAlign w:val="top"/>
-          </w:tcPr>
-          <w:p>
-            <w:pPr>
-              <w:spacing w:after="50" w:line="260"/>
-            </w:pPr>
-            <w:r>
-              <w:rPr>
-                <w:rFonts w:ascii="Arial" w:cs="Arial" w:eastAsia="Arial" w:hAnsi="Arial"/>
-                <w:sz w:val="19"/>
-                <w:szCs w:val="19"/>
-              </w:rPr>
-              <w:t xml:space="preserve">Upgrade OpenSSH to version 10.5 or later.</w:t>
             </w:r>
           </w:p>
         </w:tc>
@@ -7687,7 +6867,7 @@
                 <w:sz w:val="19"/>
                 <w:szCs w:val="19"/>
               </w:rPr>
-              <w:t xml:space="preserve">CCTV gateway (192.168.1.1)</w:t>
+              <w:t xml:space="preserve">About 20 devices</w:t>
             </w:r>
           </w:p>
         </w:tc>
@@ -7718,7 +6898,7 @@
                 <w:sz w:val="19"/>
                 <w:szCs w:val="19"/>
               </w:rPr>
-              <w:t xml:space="preserve">Older nginx web server with known flaws.</w:t>
+              <w:t xml:space="preserve">Remote control software has the Terrapin weakness in how it protects connections.</w:t>
             </w:r>
           </w:p>
         </w:tc>
@@ -7749,7 +6929,7 @@
                 <w:sz w:val="19"/>
                 <w:szCs w:val="19"/>
               </w:rPr>
-              <w:t xml:space="preserve">Someone could learn about your setup or disrupt a device that links many cameras.</w:t>
+              <w:t xml:space="preserve">Someone already inside the network could weaken or interfere with a remote session.</w:t>
             </w:r>
           </w:p>
         </w:tc>
@@ -7780,7 +6960,7 @@
                 <w:sz w:val="19"/>
                 <w:szCs w:val="19"/>
               </w:rPr>
-              <w:t xml:space="preserve">Upgrade nginx to 1.28.2 or later.</w:t>
+              <w:t xml:space="preserve">Update SSH software and switch off the affected ciphers.</w:t>
             </w:r>
           </w:p>
         </w:tc>
@@ -7816,7 +6996,7 @@
                 <w:sz w:val="19"/>
                 <w:szCs w:val="19"/>
               </w:rPr>
-              <w:t xml:space="preserve">About 20 devices</w:t>
+              <w:t xml:space="preserve">3 devices</w:t>
             </w:r>
           </w:p>
         </w:tc>
@@ -7847,7 +7027,7 @@
                 <w:sz w:val="19"/>
                 <w:szCs w:val="19"/>
               </w:rPr>
-              <w:t xml:space="preserve">Remote control software has the Terrapin weakness in how it protects connections.</w:t>
+              <w:t xml:space="preserve">Old TLS 1.0 and 1.1 are still allowed. 192.168.0.223 also allows weak and export-grade ciphers (FREAK).</w:t>
             </w:r>
           </w:p>
         </w:tc>
@@ -7878,7 +7058,7 @@
                 <w:sz w:val="19"/>
                 <w:szCs w:val="19"/>
               </w:rPr>
-              <w:t xml:space="preserve">Someone already inside the network could weaken or interfere with a remote session.</w:t>
+              <w:t xml:space="preserve">Weaker protection of data and logins.</w:t>
             </w:r>
           </w:p>
         </w:tc>
@@ -7909,136 +7089,7 @@
                 <w:sz w:val="19"/>
                 <w:szCs w:val="19"/>
               </w:rPr>
-              <w:t xml:space="preserve">Update SSH software and switch off the affected ciphers.</w:t>
-            </w:r>
-          </w:p>
-        </w:tc>
-      </w:tr>
-      <w:tr>
-        <w:trPr>
-          <w:cantSplit/>
-        </w:trPr>
-        <w:tc>
-          <w:tcPr>
-            <w:tcW w:type="dxa" w:w="1750"/>
-            <w:tcBorders>
-              <w:top w:val="single" w:color="BFC7D5" w:sz="4"/>
-              <w:left w:val="single" w:color="BFC7D5" w:sz="4"/>
-              <w:bottom w:val="single" w:color="BFC7D5" w:sz="4"/>
-              <w:right w:val="single" w:color="BFC7D5" w:sz="4"/>
-            </w:tcBorders>
-            <w:tcMar>
-              <w:top w:type="dxa" w:w="70"/>
-              <w:left w:type="dxa" w:w="110"/>
-              <w:bottom w:type="dxa" w:w="70"/>
-              <w:right w:type="dxa" w:w="110"/>
-            </w:tcMar>
-            <w:vAlign w:val="top"/>
-          </w:tcPr>
-          <w:p>
-            <w:pPr>
-              <w:spacing w:after="50" w:line="260"/>
-            </w:pPr>
-            <w:r>
-              <w:rPr>
-                <w:rFonts w:ascii="Arial" w:cs="Arial" w:eastAsia="Arial" w:hAnsi="Arial"/>
-                <w:sz w:val="19"/>
-                <w:szCs w:val="19"/>
-              </w:rPr>
-              <w:t xml:space="preserve">3 devices</w:t>
-            </w:r>
-          </w:p>
-        </w:tc>
-        <w:tc>
-          <w:tcPr>
-            <w:tcW w:type="dxa" w:w="2500"/>
-            <w:tcBorders>
-              <w:top w:val="single" w:color="BFC7D5" w:sz="4"/>
-              <w:left w:val="single" w:color="BFC7D5" w:sz="4"/>
-              <w:bottom w:val="single" w:color="BFC7D5" w:sz="4"/>
-              <w:right w:val="single" w:color="BFC7D5" w:sz="4"/>
-            </w:tcBorders>
-            <w:tcMar>
-              <w:top w:type="dxa" w:w="70"/>
-              <w:left w:type="dxa" w:w="110"/>
-              <w:bottom w:type="dxa" w:w="70"/>
-              <w:right w:type="dxa" w:w="110"/>
-            </w:tcMar>
-            <w:vAlign w:val="top"/>
-          </w:tcPr>
-          <w:p>
-            <w:pPr>
-              <w:spacing w:after="50" w:line="260"/>
-            </w:pPr>
-            <w:r>
-              <w:rPr>
-                <w:rFonts w:ascii="Arial" w:cs="Arial" w:eastAsia="Arial" w:hAnsi="Arial"/>
-                <w:sz w:val="19"/>
-                <w:szCs w:val="19"/>
-              </w:rPr>
-              <w:t xml:space="preserve">Old TLS 1.0 and 1.1 are still allowed. Others (192.168.1.146 and 192.168.0.223) have old Dropbear and weak cipher issues.</w:t>
-            </w:r>
-          </w:p>
-        </w:tc>
-        <w:tc>
-          <w:tcPr>
-            <w:tcW w:type="dxa" w:w="2600"/>
-            <w:tcBorders>
-              <w:top w:val="single" w:color="BFC7D5" w:sz="4"/>
-              <w:left w:val="single" w:color="BFC7D5" w:sz="4"/>
-              <w:bottom w:val="single" w:color="BFC7D5" w:sz="4"/>
-              <w:right w:val="single" w:color="BFC7D5" w:sz="4"/>
-            </w:tcBorders>
-            <w:tcMar>
-              <w:top w:type="dxa" w:w="70"/>
-              <w:left w:type="dxa" w:w="110"/>
-              <w:bottom w:type="dxa" w:w="70"/>
-              <w:right w:type="dxa" w:w="110"/>
-            </w:tcMar>
-            <w:vAlign w:val="top"/>
-          </w:tcPr>
-          <w:p>
-            <w:pPr>
-              <w:spacing w:after="50" w:line="260"/>
-            </w:pPr>
-            <w:r>
-              <w:rPr>
-                <w:rFonts w:ascii="Arial" w:cs="Arial" w:eastAsia="Arial" w:hAnsi="Arial"/>
-                <w:sz w:val="19"/>
-                <w:szCs w:val="19"/>
-              </w:rPr>
-              <w:t xml:space="preserve">Weaker protection of data and logins.</w:t>
-            </w:r>
-          </w:p>
-        </w:tc>
-        <w:tc>
-          <w:tcPr>
-            <w:tcW w:type="dxa" w:w="3056"/>
-            <w:tcBorders>
-              <w:top w:val="single" w:color="BFC7D5" w:sz="4"/>
-              <w:left w:val="single" w:color="BFC7D5" w:sz="4"/>
-              <w:bottom w:val="single" w:color="BFC7D5" w:sz="4"/>
-              <w:right w:val="single" w:color="BFC7D5" w:sz="4"/>
-            </w:tcBorders>
-            <w:tcMar>
-              <w:top w:type="dxa" w:w="70"/>
-              <w:left w:type="dxa" w:w="110"/>
-              <w:bottom w:type="dxa" w:w="70"/>
-              <w:right w:type="dxa" w:w="110"/>
-            </w:tcMar>
-            <w:vAlign w:val="top"/>
-          </w:tcPr>
-          <w:p>
-            <w:pPr>
-              <w:spacing w:after="50" w:line="260"/>
-            </w:pPr>
-            <w:r>
-              <w:rPr>
-                <w:rFonts w:ascii="Arial" w:cs="Arial" w:eastAsia="Arial" w:hAnsi="Arial"/>
-                <w:sz w:val="19"/>
-                <w:szCs w:val="19"/>
-              </w:rPr>
-              <w:t xml:space="preserve">Allow TLS 1.2 or higher only. Update Dropbear.</w:t>
+              <w:t xml:space="preserve">Allow TLS 1.2 or higher only. Remove weak ciphers.</w:t>
             </w:r>
           </w:p>
         </w:tc>
@@ -8072,7 +7123,7 @@
           <w:sz w:val="21"/>
           <w:szCs w:val="21"/>
         </w:rPr>
-        <w:t xml:space="preserve">Four smaller issues relate to older SSH protection settings and short digital keys (RSA keys under 2048 bits on 9 devices). On their own they do little harm but together with the bigger gaps they make an attacker’s job easier. Clean them up after the urgent work.</w:t>
+        <w:t xml:space="preserve">Four smaller issues relate to weak SSH encryption settings and short digital keys (RSA keys under 2048 bits on 9 devices). On their own they do little harm but together with the bigger gaps they make an attacker’s job easier. Clean them up after the urgent work.</w:t>
       </w:r>
     </w:p>
     <w:p>

</xml_diff>

<commit_message>
Move control build-out into days 0 to 7 of the roadmap
Co-Authored-By: Claude Sonnet 5.5 <noreply@anthropic.com>
Claude-Session: https://claude.ai/code/session_01LugvseKmF2BjFkEv28Djej
</commit_message>
<xml_diff>
--- a/Anjali_Labtech_Executive_Security_Summary.docx
+++ b/Anjali_Labtech_Executive_Security_Summary.docx
@@ -7358,7 +7358,7 @@
                 <w:sz w:val="19"/>
                 <w:szCs w:val="19"/>
               </w:rPr>
-              <w:t xml:space="preserve">Contain</w:t>
+              <w:t xml:space="preserve">Contain and build controls</w:t>
             </w:r>
           </w:p>
         </w:tc>
@@ -7389,7 +7389,7 @@
                 <w:sz w:val="19"/>
                 <w:szCs w:val="19"/>
               </w:rPr>
-              <w:t xml:space="preserve">Isolate and investigate the 2 possibly compromised computers. Patch or isolate computers open to EternalBlue and BlueKeep. Switch off SMBv1 and Telnet. Fix the 4 Very serious CCTV findings. Remove Flash and Internet Explorer.</w:t>
+              <w:t xml:space="preserve">Isolate and investigate the 2 possibly compromised computers. Patch or isolate computers open to EternalBlue and BlueKeep. Switch off SMBv1 and Telnet. Fix the 4 Very serious CCTV findings. Remove Flash and Internet Explorer. Deploy EDR or XDR everywhere. Install a modern firewall with internal separation. Move CCTV to its own network. Central IP addressing with IP and MAC binding. Active Directory with Group Policy.</w:t>
             </w:r>
           </w:p>
         </w:tc>
@@ -7420,7 +7420,7 @@
                 <w:sz w:val="19"/>
                 <w:szCs w:val="19"/>
               </w:rPr>
-              <w:t xml:space="preserve">The most dangerous doors are closed. We know whether anyone is already inside.</w:t>
+              <w:t xml:space="preserve">The most dangerous doors are closed. We know whether anyone is already inside. Attacks are caught early and cannot spread freely.</w:t>
             </w:r>
           </w:p>
         </w:tc>
@@ -7552,120 +7552,6 @@
               <w:bottom w:val="single" w:color="BFC7D5" w:sz="4"/>
               <w:right w:val="single" w:color="BFC7D5" w:sz="4"/>
             </w:tcBorders>
-            <w:shd w:fill="FFF4CC" w:color="auto" w:val="clear"/>
-            <w:tcMar>
-              <w:top w:type="dxa" w:w="70"/>
-              <w:left w:type="dxa" w:w="110"/>
-              <w:bottom w:type="dxa" w:w="70"/>
-              <w:right w:type="dxa" w:w="110"/>
-            </w:tcMar>
-            <w:vAlign w:val="top"/>
-          </w:tcPr>
-          <w:p>
-            <w:pPr>
-              <w:spacing w:after="50" w:line="260"/>
-            </w:pPr>
-            <w:r>
-              <w:rPr>
-                <w:rFonts w:ascii="Arial" w:cs="Arial" w:eastAsia="Arial" w:hAnsi="Arial"/>
-                <w:b/>
-                <w:bCs/>
-                <w:sz w:val="19"/>
-                <w:szCs w:val="19"/>
-              </w:rPr>
-              <w:t xml:space="preserve">Days 31 to 60</w:t>
-            </w:r>
-          </w:p>
-          <w:p>
-            <w:pPr>
-              <w:spacing w:after="50" w:line="260"/>
-            </w:pPr>
-            <w:r>
-              <w:rPr>
-                <w:rFonts w:ascii="Arial" w:cs="Arial" w:eastAsia="Arial" w:hAnsi="Arial"/>
-                <w:sz w:val="19"/>
-                <w:szCs w:val="19"/>
-              </w:rPr>
-              <w:t xml:space="preserve">Build controls</w:t>
-            </w:r>
-          </w:p>
-        </w:tc>
-        <w:tc>
-          <w:tcPr>
-            <w:tcW w:type="dxa" w:w="4300"/>
-            <w:tcBorders>
-              <w:top w:val="single" w:color="BFC7D5" w:sz="4"/>
-              <w:left w:val="single" w:color="BFC7D5" w:sz="4"/>
-              <w:bottom w:val="single" w:color="BFC7D5" w:sz="4"/>
-              <w:right w:val="single" w:color="BFC7D5" w:sz="4"/>
-            </w:tcBorders>
-            <w:tcMar>
-              <w:top w:type="dxa" w:w="70"/>
-              <w:left w:type="dxa" w:w="110"/>
-              <w:bottom w:type="dxa" w:w="70"/>
-              <w:right w:type="dxa" w:w="110"/>
-            </w:tcMar>
-            <w:vAlign w:val="top"/>
-          </w:tcPr>
-          <w:p>
-            <w:pPr>
-              <w:spacing w:after="50" w:line="260"/>
-            </w:pPr>
-            <w:r>
-              <w:rPr>
-                <w:rFonts w:ascii="Arial" w:cs="Arial" w:eastAsia="Arial" w:hAnsi="Arial"/>
-                <w:sz w:val="19"/>
-                <w:szCs w:val="19"/>
-              </w:rPr>
-              <w:t xml:space="preserve">Deploy EDR or XDR everywhere. Install a modern firewall with internal separation. Move CCTV to its own network. Central IP addressing with IP and MAC binding. Active Directory with Group Policy.</w:t>
-            </w:r>
-          </w:p>
-        </w:tc>
-        <w:tc>
-          <w:tcPr>
-            <w:tcW w:type="dxa" w:w="3906"/>
-            <w:tcBorders>
-              <w:top w:val="single" w:color="BFC7D5" w:sz="4"/>
-              <w:left w:val="single" w:color="BFC7D5" w:sz="4"/>
-              <w:bottom w:val="single" w:color="BFC7D5" w:sz="4"/>
-              <w:right w:val="single" w:color="BFC7D5" w:sz="4"/>
-            </w:tcBorders>
-            <w:tcMar>
-              <w:top w:type="dxa" w:w="70"/>
-              <w:left w:type="dxa" w:w="110"/>
-              <w:bottom w:type="dxa" w:w="70"/>
-              <w:right w:type="dxa" w:w="110"/>
-            </w:tcMar>
-            <w:vAlign w:val="top"/>
-          </w:tcPr>
-          <w:p>
-            <w:pPr>
-              <w:spacing w:after="50" w:line="260"/>
-            </w:pPr>
-            <w:r>
-              <w:rPr>
-                <w:rFonts w:ascii="Arial" w:cs="Arial" w:eastAsia="Arial" w:hAnsi="Arial"/>
-                <w:sz w:val="19"/>
-                <w:szCs w:val="19"/>
-              </w:rPr>
-              <w:t xml:space="preserve">Attacks are caught early and cannot spread freely.</w:t>
-            </w:r>
-          </w:p>
-        </w:tc>
-      </w:tr>
-      <w:tr>
-        <w:trPr>
-          <w:cantSplit/>
-        </w:trPr>
-        <w:tc>
-          <w:tcPr>
-            <w:tcW w:type="dxa" w:w="1700"/>
-            <w:tcBorders>
-              <w:top w:val="single" w:color="BFC7D5" w:sz="4"/>
-              <w:left w:val="single" w:color="BFC7D5" w:sz="4"/>
-              <w:bottom w:val="single" w:color="BFC7D5" w:sz="4"/>
-              <w:right w:val="single" w:color="BFC7D5" w:sz="4"/>
-            </w:tcBorders>
             <w:shd w:fill="E5F3E6" w:color="auto" w:val="clear"/>
             <w:tcMar>
               <w:top w:type="dxa" w:w="70"/>
@@ -7687,7 +7573,7 @@
                 <w:sz w:val="19"/>
                 <w:szCs w:val="19"/>
               </w:rPr>
-              <w:t xml:space="preserve">Days 61 to 90</w:t>
+              <w:t xml:space="preserve">Days 31 to 90</w:t>
             </w:r>
           </w:p>
           <w:p>
@@ -11968,7 +11854,7 @@
                 <w:sz w:val="19"/>
                 <w:szCs w:val="19"/>
               </w:rPr>
-              <w:t xml:space="preserve">First 30 days. Contain and fix the most dangerous issues and agree the full plan.</w:t>
+              <w:t xml:space="preserve">First 30 days. Contain the most dangerous issues and put the core controls in place (EDR or XDR and firewall and CCTV isolation and central administration).</w:t>
             </w:r>
           </w:p>
         </w:tc>
@@ -12082,7 +11968,7 @@
                 <w:sz w:val="19"/>
                 <w:szCs w:val="19"/>
               </w:rPr>
-              <w:t xml:space="preserve">Days 31 to 90. EDR or XDR and firewall and CCTV isolation and central administration.</w:t>
+              <w:t xml:space="preserve">Days 31 to 90. Close the remaining findings and standardise certificates and inventory. Start scheduled scans.</w:t>
             </w:r>
           </w:p>
         </w:tc>
@@ -12113,7 +11999,7 @@
                 <w:sz w:val="19"/>
                 <w:szCs w:val="19"/>
               </w:rPr>
-              <w:t xml:space="preserve">The root causes are closed.</w:t>
+              <w:t xml:space="preserve">Everything is verified and kept up to date.</w:t>
             </w:r>
           </w:p>
         </w:tc>

</xml_diff>